<commit_message>
bar plot and keyword
</commit_message>
<xml_diff>
--- a/Explainable AI in Computer Vision for Agricultural Disease and pest.docx
+++ b/Explainable AI in Computer Vision for Agricultural Disease and pest.docx
@@ -140,7 +140,27 @@
           <w:sz w:val="24"/>
           <w:szCs w:val="24"/>
         </w:rPr>
-        <w:t xml:space="preserve"> in this literature. All 30 papers used XAI methods (GradCAM, LIME, SHAP, etc.) purely as </w:t>
+        <w:t xml:space="preserve"> in this literature. All 30 papers used XAI methods (</w:t>
+      </w:r>
+      <w:proofErr w:type="spellStart"/>
+      <w:r>
+        <w:rPr>
+          <w:rFonts w:ascii="Times New Roman" w:hAnsi="Times New Roman" w:cs="Times New Roman"/>
+          <w:color w:val="EE0000"/>
+          <w:sz w:val="24"/>
+          <w:szCs w:val="24"/>
+        </w:rPr>
+        <w:t>GradCAM</w:t>
+      </w:r>
+      <w:proofErr w:type="spellEnd"/>
+      <w:r>
+        <w:rPr>
+          <w:rFonts w:ascii="Times New Roman" w:hAnsi="Times New Roman" w:cs="Times New Roman"/>
+          <w:color w:val="EE0000"/>
+          <w:sz w:val="24"/>
+          <w:szCs w:val="24"/>
+        </w:rPr>
+        <w:t xml:space="preserve">, LIME, SHAP, etc.) purely as </w:t>
       </w:r>
       <w:r>
         <w:rPr>
@@ -760,14 +780,25 @@
           <w:szCs w:val="24"/>
         </w:rPr>
       </w:pPr>
-      <w:r>
-        <w:rPr>
-          <w:rFonts w:ascii="Times New Roman" w:hAnsi="Times New Roman" w:cs="Times New Roman"/>
-          <w:color w:val="EE0000"/>
-          <w:sz w:val="24"/>
-          <w:szCs w:val="24"/>
-        </w:rPr>
-        <w:t>GradCAM dominates; LIME and SHAP are secondary</w:t>
+      <w:proofErr w:type="spellStart"/>
+      <w:r>
+        <w:rPr>
+          <w:rFonts w:ascii="Times New Roman" w:hAnsi="Times New Roman" w:cs="Times New Roman"/>
+          <w:color w:val="EE0000"/>
+          <w:sz w:val="24"/>
+          <w:szCs w:val="24"/>
+        </w:rPr>
+        <w:t>GradCAM</w:t>
+      </w:r>
+      <w:proofErr w:type="spellEnd"/>
+      <w:r>
+        <w:rPr>
+          <w:rFonts w:ascii="Times New Roman" w:hAnsi="Times New Roman" w:cs="Times New Roman"/>
+          <w:color w:val="EE0000"/>
+          <w:sz w:val="24"/>
+          <w:szCs w:val="24"/>
+        </w:rPr>
+        <w:t xml:space="preserve"> dominates; LIME and SHAP are secondary</w:t>
       </w:r>
     </w:p>
     <w:p>
@@ -2978,8 +3009,59 @@
           <w:sz w:val="24"/>
           <w:szCs w:val="24"/>
         </w:rPr>
-        <w:t>Convolutional Neural Networks: MobileNetV2, EfficientNet, ResNet, VGG, DenseNet</w:t>
-      </w:r>
+        <w:t xml:space="preserve">Convolutional Neural Networks: MobileNetV2, </w:t>
+      </w:r>
+      <w:proofErr w:type="spellStart"/>
+      <w:r>
+        <w:rPr>
+          <w:rFonts w:ascii="Times New Roman" w:hAnsi="Times New Roman" w:cs="Times New Roman"/>
+          <w:color w:val="EE0000"/>
+          <w:sz w:val="24"/>
+          <w:szCs w:val="24"/>
+        </w:rPr>
+        <w:t>EfficientNet</w:t>
+      </w:r>
+      <w:proofErr w:type="spellEnd"/>
+      <w:r>
+        <w:rPr>
+          <w:rFonts w:ascii="Times New Roman" w:hAnsi="Times New Roman" w:cs="Times New Roman"/>
+          <w:color w:val="EE0000"/>
+          <w:sz w:val="24"/>
+          <w:szCs w:val="24"/>
+        </w:rPr>
+        <w:t xml:space="preserve">, </w:t>
+      </w:r>
+      <w:proofErr w:type="spellStart"/>
+      <w:r>
+        <w:rPr>
+          <w:rFonts w:ascii="Times New Roman" w:hAnsi="Times New Roman" w:cs="Times New Roman"/>
+          <w:color w:val="EE0000"/>
+          <w:sz w:val="24"/>
+          <w:szCs w:val="24"/>
+        </w:rPr>
+        <w:t>ResNet</w:t>
+      </w:r>
+      <w:proofErr w:type="spellEnd"/>
+      <w:r>
+        <w:rPr>
+          <w:rFonts w:ascii="Times New Roman" w:hAnsi="Times New Roman" w:cs="Times New Roman"/>
+          <w:color w:val="EE0000"/>
+          <w:sz w:val="24"/>
+          <w:szCs w:val="24"/>
+        </w:rPr>
+        <w:t xml:space="preserve">, VGG, </w:t>
+      </w:r>
+      <w:proofErr w:type="spellStart"/>
+      <w:r>
+        <w:rPr>
+          <w:rFonts w:ascii="Times New Roman" w:hAnsi="Times New Roman" w:cs="Times New Roman"/>
+          <w:color w:val="EE0000"/>
+          <w:sz w:val="24"/>
+          <w:szCs w:val="24"/>
+        </w:rPr>
+        <w:t>DenseNet</w:t>
+      </w:r>
+      <w:proofErr w:type="spellEnd"/>
     </w:p>
     <w:p>
       <w:pPr>
@@ -3001,7 +3083,27 @@
           <w:sz w:val="24"/>
           <w:szCs w:val="24"/>
         </w:rPr>
-        <w:t>Vision Transformers (ViT) and Swin Transformer</w:t>
+        <w:t>Vision Transformers (</w:t>
+      </w:r>
+      <w:proofErr w:type="spellStart"/>
+      <w:r>
+        <w:rPr>
+          <w:rFonts w:ascii="Times New Roman" w:hAnsi="Times New Roman" w:cs="Times New Roman"/>
+          <w:color w:val="EE0000"/>
+          <w:sz w:val="24"/>
+          <w:szCs w:val="24"/>
+        </w:rPr>
+        <w:t>ViT</w:t>
+      </w:r>
+      <w:proofErr w:type="spellEnd"/>
+      <w:r>
+        <w:rPr>
+          <w:rFonts w:ascii="Times New Roman" w:hAnsi="Times New Roman" w:cs="Times New Roman"/>
+          <w:color w:val="EE0000"/>
+          <w:sz w:val="24"/>
+          <w:szCs w:val="24"/>
+        </w:rPr>
+        <w:t>) and Swin Transformer</w:t>
       </w:r>
     </w:p>
     <w:p>
@@ -3265,6 +3367,7 @@
                 <w:szCs w:val="24"/>
               </w:rPr>
             </w:pPr>
+            <w:proofErr w:type="spellStart"/>
             <w:r>
               <w:rPr>
                 <w:rFonts w:ascii="Times New Roman" w:hAnsi="Times New Roman" w:cs="Times New Roman"/>
@@ -3272,8 +3375,49 @@
                 <w:sz w:val="24"/>
                 <w:szCs w:val="24"/>
               </w:rPr>
-              <w:t>GradCAM, GradCAM++, Guided Backprop, ScoreCAM</w:t>
+              <w:t>GradCAM</w:t>
             </w:r>
+            <w:proofErr w:type="spellEnd"/>
+            <w:r>
+              <w:rPr>
+                <w:rFonts w:ascii="Times New Roman" w:hAnsi="Times New Roman" w:cs="Times New Roman"/>
+                <w:color w:val="EE0000"/>
+                <w:sz w:val="24"/>
+                <w:szCs w:val="24"/>
+              </w:rPr>
+              <w:t xml:space="preserve">, </w:t>
+            </w:r>
+            <w:proofErr w:type="spellStart"/>
+            <w:r>
+              <w:rPr>
+                <w:rFonts w:ascii="Times New Roman" w:hAnsi="Times New Roman" w:cs="Times New Roman"/>
+                <w:color w:val="EE0000"/>
+                <w:sz w:val="24"/>
+                <w:szCs w:val="24"/>
+              </w:rPr>
+              <w:t>GradCAM</w:t>
+            </w:r>
+            <w:proofErr w:type="spellEnd"/>
+            <w:r>
+              <w:rPr>
+                <w:rFonts w:ascii="Times New Roman" w:hAnsi="Times New Roman" w:cs="Times New Roman"/>
+                <w:color w:val="EE0000"/>
+                <w:sz w:val="24"/>
+                <w:szCs w:val="24"/>
+              </w:rPr>
+              <w:t xml:space="preserve">++, Guided Backprop, </w:t>
+            </w:r>
+            <w:proofErr w:type="spellStart"/>
+            <w:r>
+              <w:rPr>
+                <w:rFonts w:ascii="Times New Roman" w:hAnsi="Times New Roman" w:cs="Times New Roman"/>
+                <w:color w:val="EE0000"/>
+                <w:sz w:val="24"/>
+                <w:szCs w:val="24"/>
+              </w:rPr>
+              <w:t>ScoreCAM</w:t>
+            </w:r>
+            <w:proofErr w:type="spellEnd"/>
           </w:p>
         </w:tc>
         <w:tc>
@@ -3374,6 +3518,7 @@
                 <w:szCs w:val="24"/>
               </w:rPr>
             </w:pPr>
+            <w:proofErr w:type="spellStart"/>
             <w:r>
               <w:rPr>
                 <w:rFonts w:ascii="Times New Roman" w:hAnsi="Times New Roman" w:cs="Times New Roman"/>
@@ -3381,7 +3526,17 @@
                 <w:sz w:val="24"/>
                 <w:szCs w:val="24"/>
               </w:rPr>
-              <w:t>Superpixel mask</w:t>
+              <w:t>Superpixel</w:t>
+            </w:r>
+            <w:proofErr w:type="spellEnd"/>
+            <w:r>
+              <w:rPr>
+                <w:rFonts w:ascii="Times New Roman" w:hAnsi="Times New Roman" w:cs="Times New Roman"/>
+                <w:color w:val="EE0000"/>
+                <w:sz w:val="24"/>
+                <w:szCs w:val="24"/>
+              </w:rPr>
+              <w:t xml:space="preserve"> mask</w:t>
             </w:r>
           </w:p>
         </w:tc>
@@ -3438,8 +3593,39 @@
                 <w:sz w:val="24"/>
                 <w:szCs w:val="24"/>
               </w:rPr>
-              <w:t>SHAP, DeepSHAP, KernelSHAP</w:t>
+              <w:t xml:space="preserve">SHAP, </w:t>
             </w:r>
+            <w:proofErr w:type="spellStart"/>
+            <w:r>
+              <w:rPr>
+                <w:rFonts w:ascii="Times New Roman" w:hAnsi="Times New Roman" w:cs="Times New Roman"/>
+                <w:color w:val="EE0000"/>
+                <w:sz w:val="24"/>
+                <w:szCs w:val="24"/>
+              </w:rPr>
+              <w:t>DeepSHAP</w:t>
+            </w:r>
+            <w:proofErr w:type="spellEnd"/>
+            <w:r>
+              <w:rPr>
+                <w:rFonts w:ascii="Times New Roman" w:hAnsi="Times New Roman" w:cs="Times New Roman"/>
+                <w:color w:val="EE0000"/>
+                <w:sz w:val="24"/>
+                <w:szCs w:val="24"/>
+              </w:rPr>
+              <w:t xml:space="preserve">, </w:t>
+            </w:r>
+            <w:proofErr w:type="spellStart"/>
+            <w:r>
+              <w:rPr>
+                <w:rFonts w:ascii="Times New Roman" w:hAnsi="Times New Roman" w:cs="Times New Roman"/>
+                <w:color w:val="EE0000"/>
+                <w:sz w:val="24"/>
+                <w:szCs w:val="24"/>
+              </w:rPr>
+              <w:t>KernelSHAP</w:t>
+            </w:r>
+            <w:proofErr w:type="spellEnd"/>
           </w:p>
         </w:tc>
         <w:tc>
@@ -3514,6 +3700,7 @@
                 <w:szCs w:val="24"/>
               </w:rPr>
             </w:pPr>
+            <w:proofErr w:type="spellStart"/>
             <w:r>
               <w:rPr>
                 <w:rFonts w:ascii="Times New Roman" w:hAnsi="Times New Roman" w:cs="Times New Roman"/>
@@ -3521,7 +3708,17 @@
                 <w:sz w:val="24"/>
                 <w:szCs w:val="24"/>
               </w:rPr>
-              <w:t>ViT attention maps, MHA visualization</w:t>
+              <w:t>ViT</w:t>
+            </w:r>
+            <w:proofErr w:type="spellEnd"/>
+            <w:r>
+              <w:rPr>
+                <w:rFonts w:ascii="Times New Roman" w:hAnsi="Times New Roman" w:cs="Times New Roman"/>
+                <w:color w:val="EE0000"/>
+                <w:sz w:val="24"/>
+                <w:szCs w:val="24"/>
+              </w:rPr>
+              <w:t xml:space="preserve"> attention maps, MHA visualization</w:t>
             </w:r>
           </w:p>
         </w:tc>
@@ -3828,7 +4025,27 @@
           <w:sz w:val="24"/>
           <w:szCs w:val="24"/>
         </w:rPr>
-        <w:t>Pointing game, IoU with annotation masks, Pixel-wise F1</w:t>
+        <w:t xml:space="preserve">Pointing game, </w:t>
+      </w:r>
+      <w:proofErr w:type="spellStart"/>
+      <w:r>
+        <w:rPr>
+          <w:rFonts w:ascii="Times New Roman" w:hAnsi="Times New Roman" w:cs="Times New Roman"/>
+          <w:color w:val="EE0000"/>
+          <w:sz w:val="24"/>
+          <w:szCs w:val="24"/>
+        </w:rPr>
+        <w:t>IoU</w:t>
+      </w:r>
+      <w:proofErr w:type="spellEnd"/>
+      <w:r>
+        <w:rPr>
+          <w:rFonts w:ascii="Times New Roman" w:hAnsi="Times New Roman" w:cs="Times New Roman"/>
+          <w:color w:val="EE0000"/>
+          <w:sz w:val="24"/>
+          <w:szCs w:val="24"/>
+        </w:rPr>
+        <w:t xml:space="preserve"> with annotation masks, Pixel-wise F1</w:t>
       </w:r>
     </w:p>
     <w:p>
@@ -4523,7 +4740,27 @@
           <w:sz w:val="24"/>
           <w:szCs w:val="24"/>
         </w:rPr>
-        <w:t>Public datasets (PlantVillage dominates)</w:t>
+        <w:t>Public datasets (</w:t>
+      </w:r>
+      <w:proofErr w:type="spellStart"/>
+      <w:r>
+        <w:rPr>
+          <w:rFonts w:ascii="Times New Roman" w:hAnsi="Times New Roman" w:cs="Times New Roman"/>
+          <w:color w:val="EE0000"/>
+          <w:sz w:val="24"/>
+          <w:szCs w:val="24"/>
+        </w:rPr>
+        <w:t>PlantVillage</w:t>
+      </w:r>
+      <w:proofErr w:type="spellEnd"/>
+      <w:r>
+        <w:rPr>
+          <w:rFonts w:ascii="Times New Roman" w:hAnsi="Times New Roman" w:cs="Times New Roman"/>
+          <w:color w:val="EE0000"/>
+          <w:sz w:val="24"/>
+          <w:szCs w:val="24"/>
+        </w:rPr>
+        <w:t xml:space="preserve"> dominates)</w:t>
       </w:r>
     </w:p>
     <w:p>
@@ -4569,7 +4806,27 @@
           <w:sz w:val="24"/>
           <w:szCs w:val="24"/>
         </w:rPr>
-        <w:t>Augmentation strategies: GAN-based, geometric, color jitter</w:t>
+        <w:t xml:space="preserve">Augmentation strategies: GAN-based, geometric, </w:t>
+      </w:r>
+      <w:proofErr w:type="spellStart"/>
+      <w:r>
+        <w:rPr>
+          <w:rFonts w:ascii="Times New Roman" w:hAnsi="Times New Roman" w:cs="Times New Roman"/>
+          <w:color w:val="EE0000"/>
+          <w:sz w:val="24"/>
+          <w:szCs w:val="24"/>
+        </w:rPr>
+        <w:t>color</w:t>
+      </w:r>
+      <w:proofErr w:type="spellEnd"/>
+      <w:r>
+        <w:rPr>
+          <w:rFonts w:ascii="Times New Roman" w:hAnsi="Times New Roman" w:cs="Times New Roman"/>
+          <w:color w:val="EE0000"/>
+          <w:sz w:val="24"/>
+          <w:szCs w:val="24"/>
+        </w:rPr>
+        <w:t xml:space="preserve"> jitter</w:t>
       </w:r>
     </w:p>
     <w:p>
@@ -4744,14 +5001,45 @@
           <w:szCs w:val="24"/>
         </w:rPr>
       </w:pPr>
-      <w:r>
-        <w:rPr>
-          <w:rFonts w:ascii="Times New Roman" w:hAnsi="Times New Roman" w:cs="Times New Roman"/>
-          <w:color w:val="EE0000"/>
-          <w:sz w:val="24"/>
-          <w:szCs w:val="24"/>
-        </w:rPr>
-        <w:t>EfficientNet rising; ViT emerging but rare</w:t>
+      <w:proofErr w:type="spellStart"/>
+      <w:r>
+        <w:rPr>
+          <w:rFonts w:ascii="Times New Roman" w:hAnsi="Times New Roman" w:cs="Times New Roman"/>
+          <w:color w:val="EE0000"/>
+          <w:sz w:val="24"/>
+          <w:szCs w:val="24"/>
+        </w:rPr>
+        <w:t>EfficientNet</w:t>
+      </w:r>
+      <w:proofErr w:type="spellEnd"/>
+      <w:r>
+        <w:rPr>
+          <w:rFonts w:ascii="Times New Roman" w:hAnsi="Times New Roman" w:cs="Times New Roman"/>
+          <w:color w:val="EE0000"/>
+          <w:sz w:val="24"/>
+          <w:szCs w:val="24"/>
+        </w:rPr>
+        <w:t xml:space="preserve"> rising; </w:t>
+      </w:r>
+      <w:proofErr w:type="spellStart"/>
+      <w:r>
+        <w:rPr>
+          <w:rFonts w:ascii="Times New Roman" w:hAnsi="Times New Roman" w:cs="Times New Roman"/>
+          <w:color w:val="EE0000"/>
+          <w:sz w:val="24"/>
+          <w:szCs w:val="24"/>
+        </w:rPr>
+        <w:t>ViT</w:t>
+      </w:r>
+      <w:proofErr w:type="spellEnd"/>
+      <w:r>
+        <w:rPr>
+          <w:rFonts w:ascii="Times New Roman" w:hAnsi="Times New Roman" w:cs="Times New Roman"/>
+          <w:color w:val="EE0000"/>
+          <w:sz w:val="24"/>
+          <w:szCs w:val="24"/>
+        </w:rPr>
+        <w:t xml:space="preserve"> emerging but rare</w:t>
       </w:r>
     </w:p>
     <w:p>
@@ -4835,14 +5123,45 @@
           <w:szCs w:val="24"/>
         </w:rPr>
       </w:pPr>
-      <w:r>
-        <w:rPr>
-          <w:rFonts w:ascii="Times New Roman" w:hAnsi="Times New Roman" w:cs="Times New Roman"/>
-          <w:color w:val="EE0000"/>
-          <w:sz w:val="24"/>
-          <w:szCs w:val="24"/>
-        </w:rPr>
-        <w:t>GradCAM and GradCAM++ appear in ~70% of papers</w:t>
+      <w:proofErr w:type="spellStart"/>
+      <w:r>
+        <w:rPr>
+          <w:rFonts w:ascii="Times New Roman" w:hAnsi="Times New Roman" w:cs="Times New Roman"/>
+          <w:color w:val="EE0000"/>
+          <w:sz w:val="24"/>
+          <w:szCs w:val="24"/>
+        </w:rPr>
+        <w:t>GradCAM</w:t>
+      </w:r>
+      <w:proofErr w:type="spellEnd"/>
+      <w:r>
+        <w:rPr>
+          <w:rFonts w:ascii="Times New Roman" w:hAnsi="Times New Roman" w:cs="Times New Roman"/>
+          <w:color w:val="EE0000"/>
+          <w:sz w:val="24"/>
+          <w:szCs w:val="24"/>
+        </w:rPr>
+        <w:t xml:space="preserve"> and </w:t>
+      </w:r>
+      <w:proofErr w:type="spellStart"/>
+      <w:r>
+        <w:rPr>
+          <w:rFonts w:ascii="Times New Roman" w:hAnsi="Times New Roman" w:cs="Times New Roman"/>
+          <w:color w:val="EE0000"/>
+          <w:sz w:val="24"/>
+          <w:szCs w:val="24"/>
+        </w:rPr>
+        <w:t>GradCAM</w:t>
+      </w:r>
+      <w:proofErr w:type="spellEnd"/>
+      <w:r>
+        <w:rPr>
+          <w:rFonts w:ascii="Times New Roman" w:hAnsi="Times New Roman" w:cs="Times New Roman"/>
+          <w:color w:val="EE0000"/>
+          <w:sz w:val="24"/>
+          <w:szCs w:val="24"/>
+        </w:rPr>
+        <w:t>++ appear in ~70% of papers</w:t>
       </w:r>
     </w:p>
     <w:p>
@@ -4934,7 +5253,27 @@
           <w:sz w:val="24"/>
           <w:szCs w:val="24"/>
         </w:rPr>
-        <w:t>Attention visualization in ViT-based papers</w:t>
+        <w:t xml:space="preserve">Attention visualization in </w:t>
+      </w:r>
+      <w:proofErr w:type="spellStart"/>
+      <w:r>
+        <w:rPr>
+          <w:rFonts w:ascii="Times New Roman" w:hAnsi="Times New Roman" w:cs="Times New Roman"/>
+          <w:color w:val="EE0000"/>
+          <w:sz w:val="24"/>
+          <w:szCs w:val="24"/>
+        </w:rPr>
+        <w:t>ViT</w:t>
+      </w:r>
+      <w:proofErr w:type="spellEnd"/>
+      <w:r>
+        <w:rPr>
+          <w:rFonts w:ascii="Times New Roman" w:hAnsi="Times New Roman" w:cs="Times New Roman"/>
+          <w:color w:val="EE0000"/>
+          <w:sz w:val="24"/>
+          <w:szCs w:val="24"/>
+        </w:rPr>
+        <w:t>-based papers</w:t>
       </w:r>
     </w:p>
     <w:p>
@@ -4991,7 +5330,27 @@
           <w:sz w:val="24"/>
           <w:szCs w:val="24"/>
         </w:rPr>
-        <w:t>CNN → GradCAM (dominant and natural pairing)</w:t>
+        <w:t xml:space="preserve">CNN → </w:t>
+      </w:r>
+      <w:proofErr w:type="spellStart"/>
+      <w:r>
+        <w:rPr>
+          <w:rFonts w:ascii="Times New Roman" w:hAnsi="Times New Roman" w:cs="Times New Roman"/>
+          <w:color w:val="EE0000"/>
+          <w:sz w:val="24"/>
+          <w:szCs w:val="24"/>
+        </w:rPr>
+        <w:t>GradCAM</w:t>
+      </w:r>
+      <w:proofErr w:type="spellEnd"/>
+      <w:r>
+        <w:rPr>
+          <w:rFonts w:ascii="Times New Roman" w:hAnsi="Times New Roman" w:cs="Times New Roman"/>
+          <w:color w:val="EE0000"/>
+          <w:sz w:val="24"/>
+          <w:szCs w:val="24"/>
+        </w:rPr>
+        <w:t xml:space="preserve"> (dominant and natural pairing)</w:t>
       </w:r>
     </w:p>
     <w:p>
@@ -5007,14 +5366,25 @@
           <w:szCs w:val="24"/>
         </w:rPr>
       </w:pPr>
-      <w:r>
-        <w:rPr>
-          <w:rFonts w:ascii="Times New Roman" w:hAnsi="Times New Roman" w:cs="Times New Roman"/>
-          <w:color w:val="EE0000"/>
-          <w:sz w:val="24"/>
-          <w:szCs w:val="24"/>
-        </w:rPr>
-        <w:t>ViT → Attention maps</w:t>
+      <w:proofErr w:type="spellStart"/>
+      <w:r>
+        <w:rPr>
+          <w:rFonts w:ascii="Times New Roman" w:hAnsi="Times New Roman" w:cs="Times New Roman"/>
+          <w:color w:val="EE0000"/>
+          <w:sz w:val="24"/>
+          <w:szCs w:val="24"/>
+        </w:rPr>
+        <w:t>ViT</w:t>
+      </w:r>
+      <w:proofErr w:type="spellEnd"/>
+      <w:r>
+        <w:rPr>
+          <w:rFonts w:ascii="Times New Roman" w:hAnsi="Times New Roman" w:cs="Times New Roman"/>
+          <w:color w:val="EE0000"/>
+          <w:sz w:val="24"/>
+          <w:szCs w:val="24"/>
+        </w:rPr>
+        <w:t xml:space="preserve"> → Attention maps</w:t>
       </w:r>
     </w:p>
     <w:p>
@@ -5366,7 +5736,27 @@
           <w:sz w:val="24"/>
           <w:szCs w:val="24"/>
         </w:rPr>
-        <w:t>Showing GradCAM heatmaps overlaid on diseased leaf regions (qualitative)</w:t>
+        <w:t xml:space="preserve">Showing </w:t>
+      </w:r>
+      <w:proofErr w:type="spellStart"/>
+      <w:r>
+        <w:rPr>
+          <w:rFonts w:ascii="Times New Roman" w:hAnsi="Times New Roman" w:cs="Times New Roman"/>
+          <w:color w:val="EE0000"/>
+          <w:sz w:val="24"/>
+          <w:szCs w:val="24"/>
+        </w:rPr>
+        <w:t>GradCAM</w:t>
+      </w:r>
+      <w:proofErr w:type="spellEnd"/>
+      <w:r>
+        <w:rPr>
+          <w:rFonts w:ascii="Times New Roman" w:hAnsi="Times New Roman" w:cs="Times New Roman"/>
+          <w:color w:val="EE0000"/>
+          <w:sz w:val="24"/>
+          <w:szCs w:val="24"/>
+        </w:rPr>
+        <w:t xml:space="preserve"> heatmaps overlaid on diseased leaf regions (qualitative)</w:t>
       </w:r>
     </w:p>
     <w:p>
@@ -5436,7 +5826,27 @@
           <w:sz w:val="24"/>
           <w:szCs w:val="24"/>
         </w:rPr>
-        <w:t>No faithfulness scores (insertion/deletion), no localization metrics (pointing game, IoU)</w:t>
+        <w:t xml:space="preserve">No faithfulness scores (insertion/deletion), no localization metrics (pointing game, </w:t>
+      </w:r>
+      <w:proofErr w:type="spellStart"/>
+      <w:r>
+        <w:rPr>
+          <w:rFonts w:ascii="Times New Roman" w:hAnsi="Times New Roman" w:cs="Times New Roman"/>
+          <w:color w:val="EE0000"/>
+          <w:sz w:val="24"/>
+          <w:szCs w:val="24"/>
+        </w:rPr>
+        <w:t>IoU</w:t>
+      </w:r>
+      <w:proofErr w:type="spellEnd"/>
+      <w:r>
+        <w:rPr>
+          <w:rFonts w:ascii="Times New Roman" w:hAnsi="Times New Roman" w:cs="Times New Roman"/>
+          <w:color w:val="EE0000"/>
+          <w:sz w:val="24"/>
+          <w:szCs w:val="24"/>
+        </w:rPr>
+        <w:t>)</w:t>
       </w:r>
     </w:p>
     <w:p>
@@ -5612,14 +6022,25 @@
           <w:szCs w:val="24"/>
         </w:rPr>
       </w:pPr>
-      <w:r>
-        <w:rPr>
-          <w:rFonts w:ascii="Times New Roman" w:hAnsi="Times New Roman" w:cs="Times New Roman"/>
-          <w:color w:val="EE0000"/>
-          <w:sz w:val="24"/>
-          <w:szCs w:val="24"/>
-        </w:rPr>
-        <w:t>GradCAM used to highlight lesion regions — visually compelling but unvalidated</w:t>
+      <w:proofErr w:type="spellStart"/>
+      <w:r>
+        <w:rPr>
+          <w:rFonts w:ascii="Times New Roman" w:hAnsi="Times New Roman" w:cs="Times New Roman"/>
+          <w:color w:val="EE0000"/>
+          <w:sz w:val="24"/>
+          <w:szCs w:val="24"/>
+        </w:rPr>
+        <w:t>GradCAM</w:t>
+      </w:r>
+      <w:proofErr w:type="spellEnd"/>
+      <w:r>
+        <w:rPr>
+          <w:rFonts w:ascii="Times New Roman" w:hAnsi="Times New Roman" w:cs="Times New Roman"/>
+          <w:color w:val="EE0000"/>
+          <w:sz w:val="24"/>
+          <w:szCs w:val="24"/>
+        </w:rPr>
+        <w:t xml:space="preserve"> used to highlight lesion regions — visually compelling but unvalidated</w:t>
       </w:r>
     </w:p>
     <w:p>
@@ -5893,7 +6314,27 @@
           <w:sz w:val="24"/>
           <w:szCs w:val="24"/>
         </w:rPr>
-        <w:t>Thermal imaging with ViT for plant stress diagnosis</w:t>
+        <w:t xml:space="preserve">Thermal imaging with </w:t>
+      </w:r>
+      <w:proofErr w:type="spellStart"/>
+      <w:r>
+        <w:rPr>
+          <w:rFonts w:ascii="Times New Roman" w:hAnsi="Times New Roman" w:cs="Times New Roman"/>
+          <w:color w:val="EE0000"/>
+          <w:sz w:val="24"/>
+          <w:szCs w:val="24"/>
+        </w:rPr>
+        <w:t>ViT</w:t>
+      </w:r>
+      <w:proofErr w:type="spellEnd"/>
+      <w:r>
+        <w:rPr>
+          <w:rFonts w:ascii="Times New Roman" w:hAnsi="Times New Roman" w:cs="Times New Roman"/>
+          <w:color w:val="EE0000"/>
+          <w:sz w:val="24"/>
+          <w:szCs w:val="24"/>
+        </w:rPr>
+        <w:t xml:space="preserve"> for plant stress diagnosis</w:t>
       </w:r>
     </w:p>
     <w:p>
@@ -6007,7 +6448,27 @@
           <w:sz w:val="24"/>
           <w:szCs w:val="24"/>
         </w:rPr>
-        <w:t>MobileNetV2, CNN-SVM, and EfficientNet-lite for resource-constrained devices</w:t>
+        <w:t xml:space="preserve">MobileNetV2, CNN-SVM, and </w:t>
+      </w:r>
+      <w:proofErr w:type="spellStart"/>
+      <w:r>
+        <w:rPr>
+          <w:rFonts w:ascii="Times New Roman" w:hAnsi="Times New Roman" w:cs="Times New Roman"/>
+          <w:color w:val="EE0000"/>
+          <w:sz w:val="24"/>
+          <w:szCs w:val="24"/>
+        </w:rPr>
+        <w:t>EfficientNet</w:t>
+      </w:r>
+      <w:proofErr w:type="spellEnd"/>
+      <w:r>
+        <w:rPr>
+          <w:rFonts w:ascii="Times New Roman" w:hAnsi="Times New Roman" w:cs="Times New Roman"/>
+          <w:color w:val="EE0000"/>
+          <w:sz w:val="24"/>
+          <w:szCs w:val="24"/>
+        </w:rPr>
+        <w:t>-lite for resource-constrained devices</w:t>
       </w:r>
     </w:p>
     <w:p>
@@ -6269,7 +6730,27 @@
           <w:sz w:val="24"/>
           <w:szCs w:val="24"/>
         </w:rPr>
-        <w:t>Over-reliance on PlantVillage: lab-captured, single-leaf, uniform background</w:t>
+        <w:t xml:space="preserve">Over-reliance on </w:t>
+      </w:r>
+      <w:proofErr w:type="spellStart"/>
+      <w:r>
+        <w:rPr>
+          <w:rFonts w:ascii="Times New Roman" w:hAnsi="Times New Roman" w:cs="Times New Roman"/>
+          <w:color w:val="EE0000"/>
+          <w:sz w:val="24"/>
+          <w:szCs w:val="24"/>
+        </w:rPr>
+        <w:t>PlantVillage</w:t>
+      </w:r>
+      <w:proofErr w:type="spellEnd"/>
+      <w:r>
+        <w:rPr>
+          <w:rFonts w:ascii="Times New Roman" w:hAnsi="Times New Roman" w:cs="Times New Roman"/>
+          <w:color w:val="EE0000"/>
+          <w:sz w:val="24"/>
+          <w:szCs w:val="24"/>
+        </w:rPr>
+        <w:t>: lab-captured, single-leaf, uniform background</w:t>
       </w:r>
     </w:p>
     <w:p>
@@ -6553,7 +7034,27 @@
           <w:sz w:val="24"/>
           <w:szCs w:val="24"/>
         </w:rPr>
-        <w:t>Available metrics not used: Insertion/Deletion score, AOPC, Pointing Game, IoU vs. annotation, human evaluation</w:t>
+        <w:t xml:space="preserve">Available metrics not used: Insertion/Deletion score, AOPC, Pointing Game, </w:t>
+      </w:r>
+      <w:proofErr w:type="spellStart"/>
+      <w:r>
+        <w:rPr>
+          <w:rFonts w:ascii="Times New Roman" w:hAnsi="Times New Roman" w:cs="Times New Roman"/>
+          <w:color w:val="EE0000"/>
+          <w:sz w:val="24"/>
+          <w:szCs w:val="24"/>
+        </w:rPr>
+        <w:t>IoU</w:t>
+      </w:r>
+      <w:proofErr w:type="spellEnd"/>
+      <w:r>
+        <w:rPr>
+          <w:rFonts w:ascii="Times New Roman" w:hAnsi="Times New Roman" w:cs="Times New Roman"/>
+          <w:color w:val="EE0000"/>
+          <w:sz w:val="24"/>
+          <w:szCs w:val="24"/>
+        </w:rPr>
+        <w:t xml:space="preserve"> vs. annotation, human evaluation</w:t>
       </w:r>
     </w:p>
     <w:p>
@@ -6633,7 +7134,27 @@
           <w:sz w:val="24"/>
           <w:szCs w:val="24"/>
         </w:rPr>
-        <w:t>Papers select GradCAM without comparing to LIME, SHAP, or alternatives</w:t>
+        <w:t xml:space="preserve">Papers select </w:t>
+      </w:r>
+      <w:proofErr w:type="spellStart"/>
+      <w:r>
+        <w:rPr>
+          <w:rFonts w:ascii="Times New Roman" w:hAnsi="Times New Roman" w:cs="Times New Roman"/>
+          <w:color w:val="EE0000"/>
+          <w:sz w:val="24"/>
+          <w:szCs w:val="24"/>
+        </w:rPr>
+        <w:t>GradCAM</w:t>
+      </w:r>
+      <w:proofErr w:type="spellEnd"/>
+      <w:r>
+        <w:rPr>
+          <w:rFonts w:ascii="Times New Roman" w:hAnsi="Times New Roman" w:cs="Times New Roman"/>
+          <w:color w:val="EE0000"/>
+          <w:sz w:val="24"/>
+          <w:szCs w:val="24"/>
+        </w:rPr>
+        <w:t xml:space="preserve"> without comparing to LIME, SHAP, or alternatives</w:t>
       </w:r>
     </w:p>
     <w:p>
@@ -6782,7 +7303,27 @@
           <w:sz w:val="24"/>
           <w:szCs w:val="24"/>
         </w:rPr>
-        <w:t>Rare cross-dataset validation (train on PlantVillage, test on field images)</w:t>
+        <w:t xml:space="preserve">Rare cross-dataset validation (train on </w:t>
+      </w:r>
+      <w:proofErr w:type="spellStart"/>
+      <w:r>
+        <w:rPr>
+          <w:rFonts w:ascii="Times New Roman" w:hAnsi="Times New Roman" w:cs="Times New Roman"/>
+          <w:color w:val="EE0000"/>
+          <w:sz w:val="24"/>
+          <w:szCs w:val="24"/>
+        </w:rPr>
+        <w:t>PlantVillage</w:t>
+      </w:r>
+      <w:proofErr w:type="spellEnd"/>
+      <w:r>
+        <w:rPr>
+          <w:rFonts w:ascii="Times New Roman" w:hAnsi="Times New Roman" w:cs="Times New Roman"/>
+          <w:color w:val="EE0000"/>
+          <w:sz w:val="24"/>
+          <w:szCs w:val="24"/>
+        </w:rPr>
+        <w:t>, test on field images)</w:t>
       </w:r>
     </w:p>
     <w:p>
@@ -7250,7 +7791,27 @@
           <w:sz w:val="24"/>
           <w:szCs w:val="24"/>
         </w:rPr>
-        <w:t>Head-to-head comparison of GradCAM, LIME, SHAP, Integrated Gradients on same agricultural datasets</w:t>
+        <w:t xml:space="preserve">Head-to-head comparison of </w:t>
+      </w:r>
+      <w:proofErr w:type="spellStart"/>
+      <w:r>
+        <w:rPr>
+          <w:rFonts w:ascii="Times New Roman" w:hAnsi="Times New Roman" w:cs="Times New Roman"/>
+          <w:color w:val="EE0000"/>
+          <w:sz w:val="24"/>
+          <w:szCs w:val="24"/>
+        </w:rPr>
+        <w:t>GradCAM</w:t>
+      </w:r>
+      <w:proofErr w:type="spellEnd"/>
+      <w:r>
+        <w:rPr>
+          <w:rFonts w:ascii="Times New Roman" w:hAnsi="Times New Roman" w:cs="Times New Roman"/>
+          <w:color w:val="EE0000"/>
+          <w:sz w:val="24"/>
+          <w:szCs w:val="24"/>
+        </w:rPr>
+        <w:t>, LIME, SHAP, Integrated Gradients on same agricultural datasets</w:t>
       </w:r>
     </w:p>
     <w:p>
@@ -7307,7 +7868,27 @@
           <w:sz w:val="24"/>
           <w:szCs w:val="24"/>
         </w:rPr>
-        <w:t xml:space="preserve"> Human-Centered XAI Co-Design with Farmers and Agronomists</w:t>
+        <w:t xml:space="preserve"> Human-</w:t>
+      </w:r>
+      <w:proofErr w:type="spellStart"/>
+      <w:r>
+        <w:rPr>
+          <w:rFonts w:ascii="Times New Roman" w:hAnsi="Times New Roman" w:cs="Times New Roman"/>
+          <w:color w:val="EE0000"/>
+          <w:sz w:val="24"/>
+          <w:szCs w:val="24"/>
+        </w:rPr>
+        <w:t>Centered</w:t>
+      </w:r>
+      <w:proofErr w:type="spellEnd"/>
+      <w:r>
+        <w:rPr>
+          <w:rFonts w:ascii="Times New Roman" w:hAnsi="Times New Roman" w:cs="Times New Roman"/>
+          <w:color w:val="EE0000"/>
+          <w:sz w:val="24"/>
+          <w:szCs w:val="24"/>
+        </w:rPr>
+        <w:t xml:space="preserve"> XAI Co-Design with Farmers and Agronomists</w:t>
       </w:r>
     </w:p>
     <w:p>
@@ -7720,7 +8301,27 @@
           <w:sz w:val="24"/>
           <w:szCs w:val="24"/>
         </w:rPr>
-        <w:t>Disease progression modeling over time with XAI tracking which features evolve</w:t>
+        <w:t xml:space="preserve">Disease progression </w:t>
+      </w:r>
+      <w:proofErr w:type="spellStart"/>
+      <w:r>
+        <w:rPr>
+          <w:rFonts w:ascii="Times New Roman" w:hAnsi="Times New Roman" w:cs="Times New Roman"/>
+          <w:color w:val="EE0000"/>
+          <w:sz w:val="24"/>
+          <w:szCs w:val="24"/>
+        </w:rPr>
+        <w:t>modeling</w:t>
+      </w:r>
+      <w:proofErr w:type="spellEnd"/>
+      <w:r>
+        <w:rPr>
+          <w:rFonts w:ascii="Times New Roman" w:hAnsi="Times New Roman" w:cs="Times New Roman"/>
+          <w:color w:val="EE0000"/>
+          <w:sz w:val="24"/>
+          <w:szCs w:val="24"/>
+        </w:rPr>
+        <w:t xml:space="preserve"> over time with XAI tracking which features evolve</w:t>
       </w:r>
     </w:p>
     <w:p>
@@ -8030,7 +8631,27 @@
           <w:sz w:val="24"/>
           <w:szCs w:val="24"/>
         </w:rPr>
-        <w:t>Funding bodies: prioritize field dataset development and human-centered XAI studies</w:t>
+        <w:t>Funding bodies: prioritize field dataset development and human-</w:t>
+      </w:r>
+      <w:proofErr w:type="spellStart"/>
+      <w:r>
+        <w:rPr>
+          <w:rFonts w:ascii="Times New Roman" w:hAnsi="Times New Roman" w:cs="Times New Roman"/>
+          <w:color w:val="EE0000"/>
+          <w:sz w:val="24"/>
+          <w:szCs w:val="24"/>
+        </w:rPr>
+        <w:t>centered</w:t>
+      </w:r>
+      <w:proofErr w:type="spellEnd"/>
+      <w:r>
+        <w:rPr>
+          <w:rFonts w:ascii="Times New Roman" w:hAnsi="Times New Roman" w:cs="Times New Roman"/>
+          <w:color w:val="EE0000"/>
+          <w:sz w:val="24"/>
+          <w:szCs w:val="24"/>
+        </w:rPr>
+        <w:t xml:space="preserve"> XAI studies</w:t>
       </w:r>
     </w:p>
     <w:p>
@@ -10912,7 +11533,27 @@
           <w:sz w:val="24"/>
           <w:szCs w:val="24"/>
         </w:rPr>
-        <w:t>“explainable AI” OR “XAI” OR “explainable deep learning” OR “explainable machine learning”, combined with “object detection” OR “detect*” OR “instance segmentation” OR “YOLO” OR “Faster R-CNN”, and agricultur* OR crop* OR plant* OR “plant disease” OR “crop disease” OR pest* OR weed*</w:t>
+        <w:t xml:space="preserve">“explainable AI” OR “XAI” OR “explainable deep learning” OR “explainable machine learning”, combined with “object detection” OR “detect*” OR “instance segmentation” OR “YOLO” OR “Faster R-CNN”, and </w:t>
+      </w:r>
+      <w:proofErr w:type="spellStart"/>
+      <w:r>
+        <w:rPr>
+          <w:rFonts w:ascii="Times New Roman" w:hAnsi="Times New Roman" w:cs="Times New Roman"/>
+          <w:color w:val="0F9ED5" w:themeColor="accent4"/>
+          <w:sz w:val="24"/>
+          <w:szCs w:val="24"/>
+        </w:rPr>
+        <w:t>agricultur</w:t>
+      </w:r>
+      <w:proofErr w:type="spellEnd"/>
+      <w:r>
+        <w:rPr>
+          <w:rFonts w:ascii="Times New Roman" w:hAnsi="Times New Roman" w:cs="Times New Roman"/>
+          <w:color w:val="0F9ED5" w:themeColor="accent4"/>
+          <w:sz w:val="24"/>
+          <w:szCs w:val="24"/>
+        </w:rPr>
+        <w:t>* OR crop* OR plant* OR “plant disease” OR “crop disease” OR pest* OR weed*</w:t>
       </w:r>
       <w:r>
         <w:rPr>
@@ -11508,10 +12149,147 @@
     </w:p>
     <w:p>
       <w:pPr>
-        <w:ind w:firstLine="720"/>
         <w:jc w:val="both"/>
         <w:rPr>
           <w:rFonts w:ascii="Times New Roman" w:hAnsi="Times New Roman" w:cs="Times New Roman"/>
+          <w:color w:val="EE0000"/>
+          <w:sz w:val="24"/>
+          <w:szCs w:val="24"/>
+        </w:rPr>
+      </w:pPr>
+      <w:r>
+        <w:rPr>
+          <w:rFonts w:ascii="Times New Roman" w:hAnsi="Times New Roman" w:cs="Times New Roman"/>
+          <w:color w:val="EE0000"/>
+          <w:sz w:val="24"/>
+          <w:szCs w:val="24"/>
+        </w:rPr>
+        <w:t xml:space="preserve">Figure </w:t>
+      </w:r>
+      <w:r>
+        <w:rPr>
+          <w:rFonts w:ascii="Times New Roman" w:hAnsi="Times New Roman" w:cs="Times New Roman"/>
+          <w:color w:val="EE0000"/>
+          <w:sz w:val="24"/>
+          <w:szCs w:val="24"/>
+        </w:rPr>
+        <w:t>b</w:t>
+      </w:r>
+      <w:r>
+        <w:rPr>
+          <w:rFonts w:ascii="Times New Roman" w:hAnsi="Times New Roman" w:cs="Times New Roman"/>
+          <w:color w:val="EE0000"/>
+          <w:sz w:val="24"/>
+          <w:szCs w:val="24"/>
+        </w:rPr>
+        <w:t xml:space="preserve"> illustrates the thematic landscape derived from 28 peer-reviewed articles published between 2024 and 2026. The prominence of specific terms reflects the evolving priorities within the intersection of computer vision and precision agriculture. The dominance of terms such as "Deep Learning," "Convolutional Neural Network (CNN)," and "Transformer" underscores a robust reliance on high-performance computational architectures for feature extraction and image analysis.</w:t>
+      </w:r>
+      <w:r>
+        <w:rPr>
+          <w:rFonts w:ascii="Times New Roman" w:hAnsi="Times New Roman" w:cs="Times New Roman"/>
+          <w:color w:val="EE0000"/>
+          <w:sz w:val="24"/>
+          <w:szCs w:val="24"/>
+        </w:rPr>
+        <w:t xml:space="preserve"> </w:t>
+      </w:r>
+      <w:r>
+        <w:rPr>
+          <w:rFonts w:ascii="Times New Roman" w:hAnsi="Times New Roman" w:cs="Times New Roman"/>
+          <w:color w:val="EE0000"/>
+          <w:sz w:val="24"/>
+          <w:szCs w:val="24"/>
+        </w:rPr>
+        <w:t>A significant trend highlighted by the frequency of "Explainable AI (XAI)" and "Interpretable" indicates a critical shift in the field. Research is moving beyond "black-box" models toward systems that provide human-understandable justifications for disease and pest diagnoses, which is essential for building trust among farmers and stakeholders.</w:t>
+      </w:r>
+      <w:r>
+        <w:rPr>
+          <w:rFonts w:ascii="Times New Roman" w:hAnsi="Times New Roman" w:cs="Times New Roman"/>
+          <w:color w:val="EE0000"/>
+          <w:sz w:val="24"/>
+          <w:szCs w:val="24"/>
+        </w:rPr>
+        <w:t xml:space="preserve"> </w:t>
+      </w:r>
+      <w:r>
+        <w:rPr>
+          <w:rFonts w:ascii="Times New Roman" w:hAnsi="Times New Roman" w:cs="Times New Roman"/>
+          <w:color w:val="EE0000"/>
+          <w:sz w:val="24"/>
+          <w:szCs w:val="24"/>
+        </w:rPr>
+        <w:t xml:space="preserve">Keywords like "disease detection," "pest," "crop," and "leaf" confirm that current </w:t>
+      </w:r>
+      <w:r>
+        <w:rPr>
+          <w:rFonts w:ascii="Times New Roman" w:hAnsi="Times New Roman" w:cs="Times New Roman"/>
+          <w:color w:val="EE0000"/>
+          <w:sz w:val="24"/>
+          <w:szCs w:val="24"/>
+        </w:rPr>
+        <w:lastRenderedPageBreak/>
+        <w:t>research is heavily concentrated on early-stage pathology identification to safeguard food security and optimize pesticide application.</w:t>
+      </w:r>
+      <w:r>
+        <w:rPr>
+          <w:rFonts w:ascii="Times New Roman" w:hAnsi="Times New Roman" w:cs="Times New Roman"/>
+          <w:color w:val="EE0000"/>
+          <w:sz w:val="24"/>
+          <w:szCs w:val="24"/>
+        </w:rPr>
+        <w:t xml:space="preserve"> </w:t>
+      </w:r>
+      <w:r>
+        <w:rPr>
+          <w:rFonts w:ascii="Times New Roman" w:hAnsi="Times New Roman" w:cs="Times New Roman"/>
+          <w:color w:val="EE0000"/>
+          <w:sz w:val="24"/>
+          <w:szCs w:val="24"/>
+        </w:rPr>
+        <w:t>The presence of "Edge," "IoT," and "MobileNetV2" suggests a growing interest in deploying these complex models on lightweight, portable devices for real-time field use.</w:t>
+      </w:r>
+      <w:r>
+        <w:rPr>
+          <w:rFonts w:ascii="Times New Roman" w:hAnsi="Times New Roman" w:cs="Times New Roman"/>
+          <w:color w:val="EE0000"/>
+          <w:sz w:val="24"/>
+          <w:szCs w:val="24"/>
+        </w:rPr>
+        <w:t xml:space="preserve"> </w:t>
+      </w:r>
+      <w:r>
+        <w:rPr>
+          <w:rFonts w:ascii="Times New Roman" w:hAnsi="Times New Roman" w:cs="Times New Roman"/>
+          <w:color w:val="EE0000"/>
+          <w:sz w:val="24"/>
+          <w:szCs w:val="24"/>
+        </w:rPr>
+        <w:t>As evidenced by the bar chart, there is a clear upward trajectory in research activity within this niche. While 2024 saw a foundational 3 articles, the field experienced a significant surge in 2025 with 17 publications</w:t>
+      </w:r>
+      <w:r>
+        <w:rPr>
+          <w:rFonts w:ascii="Times New Roman" w:hAnsi="Times New Roman" w:cs="Times New Roman"/>
+          <w:color w:val="EE0000"/>
+          <w:sz w:val="24"/>
+          <w:szCs w:val="24"/>
+        </w:rPr>
+        <w:t>.</w:t>
+      </w:r>
+      <w:r>
+        <w:rPr>
+          <w:rFonts w:ascii="Times New Roman" w:hAnsi="Times New Roman" w:cs="Times New Roman"/>
+          <w:color w:val="EE0000"/>
+          <w:sz w:val="24"/>
+          <w:szCs w:val="24"/>
+        </w:rPr>
+        <w:t xml:space="preserve"> The 8 articles recorded for early 2026 suggest that interest remains high, likely continuing the momentum toward more transparent and accountable AI systems in agriculture.</w:t>
+      </w:r>
+    </w:p>
+    <w:p>
+      <w:pPr>
+        <w:jc w:val="center"/>
+        <w:rPr>
+          <w:rFonts w:ascii="Times New Roman" w:hAnsi="Times New Roman" w:cs="Times New Roman"/>
           <w:color w:val="0F9ED5" w:themeColor="accent4"/>
           <w:sz w:val="24"/>
           <w:szCs w:val="24"/>
@@ -11523,189 +12301,12 @@
           <w:color w:val="0F9ED5" w:themeColor="accent4"/>
           <w:sz w:val="24"/>
           <w:szCs w:val="24"/>
-          <w:highlight w:val="yellow"/>
-        </w:rPr>
-        <w:t xml:space="preserve">Figure </w:t>
-      </w:r>
-      <w:r>
-        <w:rPr>
-          <w:rFonts w:ascii="Times New Roman" w:hAnsi="Times New Roman" w:cs="Times New Roman"/>
-          <w:color w:val="0F9ED5" w:themeColor="accent4"/>
-          <w:sz w:val="24"/>
-          <w:szCs w:val="24"/>
-          <w:highlight w:val="yellow"/>
-        </w:rPr>
-        <w:t>b and c</w:t>
-      </w:r>
-      <w:r>
-        <w:rPr>
-          <w:rFonts w:ascii="Times New Roman" w:hAnsi="Times New Roman" w:cs="Times New Roman"/>
-          <w:color w:val="0F9ED5" w:themeColor="accent4"/>
-          <w:sz w:val="24"/>
-          <w:szCs w:val="24"/>
-        </w:rPr>
-        <w:t xml:space="preserve"> show article trend and </w:t>
-      </w:r>
-      <w:r>
-        <w:rPr>
-          <w:rFonts w:ascii="Times New Roman" w:hAnsi="Times New Roman" w:cs="Times New Roman"/>
-          <w:color w:val="0F9ED5" w:themeColor="accent4"/>
-          <w:sz w:val="24"/>
-          <w:szCs w:val="24"/>
-        </w:rPr>
-        <w:t>keyword frequency</w:t>
-      </w:r>
-      <w:r>
-        <w:rPr>
-          <w:rFonts w:ascii="Times New Roman" w:hAnsi="Times New Roman" w:cs="Times New Roman"/>
-          <w:color w:val="0F9ED5" w:themeColor="accent4"/>
-          <w:sz w:val="24"/>
-          <w:szCs w:val="24"/>
-        </w:rPr>
-        <w:t xml:space="preserve"> </w:t>
-      </w:r>
-      <w:r>
-        <w:rPr>
-          <w:rFonts w:ascii="Times New Roman" w:hAnsi="Times New Roman" w:cs="Times New Roman"/>
-          <w:color w:val="0F9ED5" w:themeColor="accent4"/>
-          <w:sz w:val="24"/>
-          <w:szCs w:val="24"/>
-        </w:rPr>
-        <w:t xml:space="preserve">for </w:t>
-      </w:r>
-      <w:r>
-        <w:rPr>
-          <w:rFonts w:ascii="Times New Roman" w:hAnsi="Times New Roman" w:cs="Times New Roman"/>
-          <w:color w:val="0F9ED5" w:themeColor="accent4"/>
-          <w:sz w:val="24"/>
-          <w:szCs w:val="24"/>
-        </w:rPr>
-        <w:t xml:space="preserve">during identification </w:t>
-      </w:r>
-      <w:r>
-        <w:rPr>
-          <w:rFonts w:ascii="Times New Roman" w:hAnsi="Times New Roman" w:cs="Times New Roman"/>
-          <w:color w:val="0F9ED5" w:themeColor="accent4"/>
-          <w:sz w:val="24"/>
-          <w:szCs w:val="24"/>
-        </w:rPr>
-        <w:t>step</w:t>
-      </w:r>
-      <w:r>
-        <w:rPr>
-          <w:rFonts w:ascii="Times New Roman" w:hAnsi="Times New Roman" w:cs="Times New Roman"/>
-          <w:color w:val="0F9ED5" w:themeColor="accent4"/>
-          <w:sz w:val="24"/>
-          <w:szCs w:val="24"/>
-        </w:rPr>
-        <w:t xml:space="preserve"> and after PRISMA Procedure</w:t>
-      </w:r>
-      <w:r>
-        <w:rPr>
-          <w:rFonts w:ascii="Times New Roman" w:hAnsi="Times New Roman" w:cs="Times New Roman"/>
-          <w:color w:val="0F9ED5" w:themeColor="accent4"/>
-          <w:sz w:val="24"/>
-          <w:szCs w:val="24"/>
-        </w:rPr>
-        <w:t xml:space="preserve"> respectively</w:t>
-      </w:r>
-      <w:r>
-        <w:rPr>
-          <w:rFonts w:ascii="Times New Roman" w:hAnsi="Times New Roman" w:cs="Times New Roman"/>
-          <w:color w:val="0F9ED5" w:themeColor="accent4"/>
-          <w:sz w:val="24"/>
-          <w:szCs w:val="24"/>
-        </w:rPr>
-        <w:t>.</w:t>
-      </w:r>
-      <w:r>
-        <w:rPr>
-          <w:rFonts w:ascii="Times New Roman" w:hAnsi="Times New Roman" w:cs="Times New Roman"/>
-          <w:color w:val="0F9ED5" w:themeColor="accent4"/>
-          <w:sz w:val="24"/>
-          <w:szCs w:val="24"/>
-        </w:rPr>
-        <w:t xml:space="preserve"> </w:t>
-      </w:r>
-      <w:r>
-        <w:rPr>
-          <w:rFonts w:ascii="Times New Roman" w:hAnsi="Times New Roman" w:cs="Times New Roman"/>
-          <w:color w:val="0F9ED5" w:themeColor="accent4"/>
-          <w:sz w:val="24"/>
-          <w:szCs w:val="24"/>
-        </w:rPr>
-        <w:t xml:space="preserve">From figure b we can identify, </w:t>
-      </w:r>
-      <w:r>
-        <w:rPr>
-          <w:rFonts w:ascii="Times New Roman" w:hAnsi="Times New Roman" w:cs="Times New Roman"/>
-          <w:color w:val="0F9ED5" w:themeColor="accent4"/>
-          <w:sz w:val="24"/>
-          <w:szCs w:val="24"/>
-        </w:rPr>
-        <w:t>t</w:t>
-      </w:r>
-      <w:r>
-        <w:rPr>
-          <w:rFonts w:ascii="Times New Roman" w:hAnsi="Times New Roman" w:cs="Times New Roman"/>
-          <w:color w:val="0F9ED5" w:themeColor="accent4"/>
-          <w:sz w:val="24"/>
-          <w:szCs w:val="24"/>
-        </w:rPr>
-        <w:t xml:space="preserve">hough XAI was introduced since 2017, the application of XAI in agriculture were started </w:t>
-      </w:r>
-      <w:r>
-        <w:rPr>
-          <w:rFonts w:ascii="Times New Roman" w:hAnsi="Times New Roman" w:cs="Times New Roman"/>
-          <w:color w:val="0F9ED5" w:themeColor="accent4"/>
-          <w:sz w:val="24"/>
-          <w:szCs w:val="24"/>
-        </w:rPr>
-        <w:t>in 2022</w:t>
-      </w:r>
-      <w:r>
-        <w:rPr>
-          <w:rFonts w:ascii="Times New Roman" w:hAnsi="Times New Roman" w:cs="Times New Roman"/>
-          <w:color w:val="0F9ED5" w:themeColor="accent4"/>
-          <w:sz w:val="24"/>
-          <w:szCs w:val="24"/>
-        </w:rPr>
-        <w:t>.</w:t>
-      </w:r>
-      <w:r>
-        <w:rPr>
-          <w:rFonts w:ascii="Times New Roman" w:hAnsi="Times New Roman" w:cs="Times New Roman"/>
-          <w:color w:val="0F9ED5" w:themeColor="accent4"/>
-          <w:sz w:val="24"/>
-          <w:szCs w:val="24"/>
-        </w:rPr>
-        <w:t xml:space="preserve"> </w:t>
-      </w:r>
-    </w:p>
-    <w:p>
-      <w:pPr>
-        <w:jc w:val="both"/>
-        <w:rPr>
-          <w:rFonts w:ascii="Times New Roman" w:hAnsi="Times New Roman" w:cs="Times New Roman"/>
-          <w:color w:val="0F9ED5" w:themeColor="accent4"/>
-          <w:sz w:val="24"/>
-          <w:szCs w:val="24"/>
-        </w:rPr>
-      </w:pPr>
-      <w:r>
-        <w:rPr>
-          <w:rFonts w:ascii="Times New Roman" w:hAnsi="Times New Roman" w:cs="Times New Roman"/>
-          <w:noProof/>
-          <w:color w:val="0F9ED5" w:themeColor="accent4"/>
-          <w:sz w:val="24"/>
-          <w:szCs w:val="24"/>
-        </w:rPr>
-        <w:lastRenderedPageBreak/>
+        </w:rPr>
         <w:drawing>
-          <wp:inline distT="0" distB="0" distL="0" distR="0" wp14:anchorId="0A44823A" wp14:editId="5AC76BC9">
-            <wp:extent cx="5731423" cy="4077970"/>
-            <wp:effectExtent l="0" t="0" r="3175" b="0"/>
-            <wp:docPr id="1533143579" name="Picture 1"/>
+          <wp:inline distT="0" distB="0" distL="0" distR="0" wp14:anchorId="773A2204" wp14:editId="6AD40BEF">
+            <wp:extent cx="5731510" cy="2272665"/>
+            <wp:effectExtent l="0" t="0" r="2540" b="0"/>
+            <wp:docPr id="655078231" name="Picture 1"/>
             <wp:cNvGraphicFramePr>
               <a:graphicFrameLocks xmlns:a="http://schemas.openxmlformats.org/drawingml/2006/main" noChangeAspect="1"/>
             </wp:cNvGraphicFramePr>
@@ -11713,7 +12314,7 @@
               <a:graphicData uri="http://schemas.openxmlformats.org/drawingml/2006/picture">
                 <pic:pic xmlns:pic="http://schemas.openxmlformats.org/drawingml/2006/picture">
                   <pic:nvPicPr>
-                    <pic:cNvPr id="1533143579" name="Picture 1"/>
+                    <pic:cNvPr id="655078231" name=""/>
                     <pic:cNvPicPr/>
                   </pic:nvPicPr>
                   <pic:blipFill>
@@ -11725,7 +12326,7 @@
                   <pic:spPr>
                     <a:xfrm>
                       <a:off x="0" y="0"/>
-                      <a:ext cx="5731423" cy="4077970"/>
+                      <a:ext cx="5731510" cy="2272665"/>
                     </a:xfrm>
                     <a:prstGeom prst="rect">
                       <a:avLst/>
@@ -11740,7 +12341,7 @@
     </w:p>
     <w:p>
       <w:pPr>
-        <w:jc w:val="center"/>
+        <w:jc w:val="both"/>
         <w:rPr>
           <w:rFonts w:ascii="Times New Roman" w:hAnsi="Times New Roman" w:cs="Times New Roman"/>
           <w:color w:val="0F9ED5" w:themeColor="accent4"/>
@@ -11756,147 +12357,6 @@
           <w:szCs w:val="24"/>
         </w:rPr>
         <w:t xml:space="preserve">Figure b. </w:t>
-      </w:r>
-      <w:r>
-        <w:rPr>
-          <w:rFonts w:ascii="Times New Roman" w:hAnsi="Times New Roman" w:cs="Times New Roman"/>
-          <w:color w:val="0F9ED5" w:themeColor="accent4"/>
-          <w:sz w:val="24"/>
-          <w:szCs w:val="24"/>
-        </w:rPr>
-        <w:t>year wise article trend</w:t>
-      </w:r>
-      <w:r>
-        <w:rPr>
-          <w:rFonts w:ascii="Times New Roman" w:hAnsi="Times New Roman" w:cs="Times New Roman"/>
-          <w:color w:val="0F9ED5" w:themeColor="accent4"/>
-          <w:sz w:val="24"/>
-          <w:szCs w:val="24"/>
-        </w:rPr>
-        <w:t xml:space="preserve"> in a.) identified articles and b.) selected articles.</w:t>
-      </w:r>
-    </w:p>
-    <w:p>
-      <w:pPr>
-        <w:jc w:val="center"/>
-        <w:rPr>
-          <w:rFonts w:ascii="Times New Roman" w:hAnsi="Times New Roman" w:cs="Times New Roman"/>
-          <w:color w:val="0F9ED5" w:themeColor="accent4"/>
-          <w:sz w:val="24"/>
-          <w:szCs w:val="24"/>
-        </w:rPr>
-      </w:pPr>
-      <w:r>
-        <w:rPr>
-          <w:rFonts w:ascii="Times New Roman" w:hAnsi="Times New Roman" w:cs="Times New Roman"/>
-          <w:noProof/>
-          <w:color w:val="0F9ED5" w:themeColor="accent4"/>
-          <w:sz w:val="24"/>
-          <w:szCs w:val="24"/>
-        </w:rPr>
-        <w:drawing>
-          <wp:inline distT="0" distB="0" distL="0" distR="0" wp14:anchorId="1400E081" wp14:editId="4EA8EDEE">
-            <wp:extent cx="4634345" cy="3920658"/>
-            <wp:effectExtent l="0" t="0" r="0" b="3810"/>
-            <wp:docPr id="147355942" name="Picture 1"/>
-            <wp:cNvGraphicFramePr>
-              <a:graphicFrameLocks xmlns:a="http://schemas.openxmlformats.org/drawingml/2006/main" noChangeAspect="1"/>
-            </wp:cNvGraphicFramePr>
-            <a:graphic xmlns:a="http://schemas.openxmlformats.org/drawingml/2006/main">
-              <a:graphicData uri="http://schemas.openxmlformats.org/drawingml/2006/picture">
-                <pic:pic xmlns:pic="http://schemas.openxmlformats.org/drawingml/2006/picture">
-                  <pic:nvPicPr>
-                    <pic:cNvPr id="147355942" name=""/>
-                    <pic:cNvPicPr/>
-                  </pic:nvPicPr>
-                  <pic:blipFill>
-                    <a:blip r:embed="rId7"/>
-                    <a:stretch>
-                      <a:fillRect/>
-                    </a:stretch>
-                  </pic:blipFill>
-                  <pic:spPr>
-                    <a:xfrm>
-                      <a:off x="0" y="0"/>
-                      <a:ext cx="4637113" cy="3923000"/>
-                    </a:xfrm>
-                    <a:prstGeom prst="rect">
-                      <a:avLst/>
-                    </a:prstGeom>
-                  </pic:spPr>
-                </pic:pic>
-              </a:graphicData>
-            </a:graphic>
-          </wp:inline>
-        </w:drawing>
-      </w:r>
-    </w:p>
-    <w:p>
-      <w:pPr>
-        <w:jc w:val="center"/>
-        <w:rPr>
-          <w:rFonts w:ascii="Times New Roman" w:hAnsi="Times New Roman" w:cs="Times New Roman"/>
-          <w:color w:val="0F9ED5" w:themeColor="accent4"/>
-          <w:sz w:val="24"/>
-          <w:szCs w:val="24"/>
-        </w:rPr>
-      </w:pPr>
-      <w:r>
-        <w:rPr>
-          <w:rFonts w:ascii="Times New Roman" w:hAnsi="Times New Roman" w:cs="Times New Roman"/>
-          <w:color w:val="0F9ED5" w:themeColor="accent4"/>
-          <w:sz w:val="24"/>
-          <w:szCs w:val="24"/>
-        </w:rPr>
-        <w:t>Figure c. Keyword cloud</w:t>
-      </w:r>
-      <w:r>
-        <w:rPr>
-          <w:rFonts w:ascii="Times New Roman" w:hAnsi="Times New Roman" w:cs="Times New Roman"/>
-          <w:color w:val="0F9ED5" w:themeColor="accent4"/>
-          <w:sz w:val="24"/>
-          <w:szCs w:val="24"/>
-        </w:rPr>
-        <w:t xml:space="preserve"> a.) in identified articles and b.) selected </w:t>
-      </w:r>
-      <w:r>
-        <w:rPr>
-          <w:rFonts w:ascii="Times New Roman" w:hAnsi="Times New Roman" w:cs="Times New Roman"/>
-          <w:color w:val="0F9ED5" w:themeColor="accent4"/>
-          <w:sz w:val="24"/>
-          <w:szCs w:val="24"/>
-        </w:rPr>
-        <w:t>articles.</w:t>
-      </w:r>
-    </w:p>
-    <w:p>
-      <w:pPr>
-        <w:jc w:val="both"/>
-        <w:rPr>
-          <w:rFonts w:ascii="Times New Roman" w:hAnsi="Times New Roman" w:cs="Times New Roman"/>
-          <w:color w:val="0F9ED5" w:themeColor="accent4"/>
-          <w:sz w:val="24"/>
-          <w:szCs w:val="24"/>
-        </w:rPr>
-      </w:pPr>
-      <w:r>
-        <w:rPr>
-          <w:rFonts w:ascii="Times New Roman" w:hAnsi="Times New Roman" w:cs="Times New Roman"/>
-          <w:color w:val="0F9ED5" w:themeColor="accent4"/>
-          <w:sz w:val="24"/>
-          <w:szCs w:val="24"/>
-        </w:rPr>
-        <w:lastRenderedPageBreak/>
-        <w:t>Table: 1</w:t>
-      </w:r>
-      <w:r>
-        <w:rPr>
-          <w:rFonts w:ascii="Times New Roman" w:hAnsi="Times New Roman" w:cs="Times New Roman"/>
-          <w:color w:val="0F9ED5" w:themeColor="accent4"/>
-          <w:sz w:val="24"/>
-          <w:szCs w:val="24"/>
-        </w:rPr>
-        <w:t xml:space="preserve"> Search strategy for selected literature</w:t>
       </w:r>
     </w:p>
     <w:tbl>
@@ -12354,7 +12814,29 @@
                 <w:lang w:eastAsia="en-IN" w:bidi="ta-IN"/>
                 <w14:ligatures w14:val="none"/>
               </w:rPr>
-              <w:t>Peer-reviewed journal articles (DOCTYPE, "ar").</w:t>
+              <w:t>Peer-reviewed journal articles (DOCTYPE, "</w:t>
+            </w:r>
+            <w:proofErr w:type="spellStart"/>
+            <w:r>
+              <w:rPr>
+                <w:rFonts w:ascii="Aptos Narrow" w:eastAsia="Times New Roman" w:hAnsi="Aptos Narrow" w:cs="Times New Roman"/>
+                <w:color w:val="000000"/>
+                <w:kern w:val="0"/>
+                <w:lang w:eastAsia="en-IN" w:bidi="ta-IN"/>
+                <w14:ligatures w14:val="none"/>
+              </w:rPr>
+              <w:t>ar</w:t>
+            </w:r>
+            <w:proofErr w:type="spellEnd"/>
+            <w:r>
+              <w:rPr>
+                <w:rFonts w:ascii="Aptos Narrow" w:eastAsia="Times New Roman" w:hAnsi="Aptos Narrow" w:cs="Times New Roman"/>
+                <w:color w:val="000000"/>
+                <w:kern w:val="0"/>
+                <w:lang w:eastAsia="en-IN" w:bidi="ta-IN"/>
+                <w14:ligatures w14:val="none"/>
+              </w:rPr>
+              <w:t>").</w:t>
             </w:r>
           </w:p>
         </w:tc>
@@ -12644,8 +13126,9 @@
                 <w:lang w:eastAsia="en-IN" w:bidi="ta-IN"/>
                 <w14:ligatures w14:val="none"/>
               </w:rPr>
-              <w:t>( TITLE ( "explainable AI" OR XAI OR "explainable deep learning" OR "explainable machine learning" ) ) AND ( TITLE-ABS-KEY ( "object detection" OR detect* OR "instance segmentation" OR YOLO OR "Faster R-CNN" ) ) AND ( TITLE-ABS-KEY ( agricultur* OR crop* OR plant* OR "plant disease" OR "crop disease" OR pest* OR weed* ) ) AND PUBYEAR &gt; 201</w:t>
+              <w:t xml:space="preserve">( TITLE ( "explainable AI" OR XAI OR "explainable deep learning" OR "explainable machine learning" ) ) AND ( TITLE-ABS-KEY ( "object detection" OR detect* OR "instance segmentation" OR YOLO OR "Faster R-CNN" ) ) AND ( TITLE-ABS-KEY ( </w:t>
             </w:r>
+            <w:proofErr w:type="spellStart"/>
             <w:r>
               <w:rPr>
                 <w:rFonts w:ascii="Aptos Narrow" w:eastAsia="Times New Roman" w:hAnsi="Aptos Narrow" w:cs="Times New Roman"/>
@@ -12654,8 +13137,9 @@
                 <w:lang w:eastAsia="en-IN" w:bidi="ta-IN"/>
                 <w14:ligatures w14:val="none"/>
               </w:rPr>
-              <w:t>6</w:t>
+              <w:t>agricultur</w:t>
             </w:r>
+            <w:proofErr w:type="spellEnd"/>
             <w:r>
               <w:rPr>
                 <w:rFonts w:ascii="Aptos Narrow" w:eastAsia="Times New Roman" w:hAnsi="Aptos Narrow" w:cs="Times New Roman"/>
@@ -12664,7 +13148,126 @@
                 <w:lang w:eastAsia="en-IN" w:bidi="ta-IN"/>
                 <w14:ligatures w14:val="none"/>
               </w:rPr>
-              <w:t xml:space="preserve"> AND PUBYEAR &lt; 2027 AND NOT ( TITLE-ABS-KEY ( human OR patient* OR medical OR medicine OR clinical OR MRI OR CT OR tumor* OR cancer* OR alzheimer* OR brain OR radiolog* OR pathology ) ) AND ( LIMIT-TO ( SUBJAREA,"AGRI" ) OR LIMIT-TO ( SUBJAREA,"COMP" ) OR LIMIT-TO ( SUBJAREA,"ENVI" ) OR LIMIT-TO ( SUBJAREA,"ENGI" ) OR LIMIT-TO ( SUBJAREA,"EART" ) ) AND ( LIMIT-TO ( DOCTYPE,"ar" ) )</w:t>
+              <w:t>* OR crop* OR plant* OR "plant disease" OR "crop disease" OR pest* OR weed* ) ) AND PUBYEAR &gt; 201</w:t>
+            </w:r>
+            <w:r>
+              <w:rPr>
+                <w:rFonts w:ascii="Aptos Narrow" w:eastAsia="Times New Roman" w:hAnsi="Aptos Narrow" w:cs="Times New Roman"/>
+                <w:color w:val="000000"/>
+                <w:kern w:val="0"/>
+                <w:lang w:eastAsia="en-IN" w:bidi="ta-IN"/>
+                <w14:ligatures w14:val="none"/>
+              </w:rPr>
+              <w:t>6</w:t>
+            </w:r>
+            <w:r>
+              <w:rPr>
+                <w:rFonts w:ascii="Aptos Narrow" w:eastAsia="Times New Roman" w:hAnsi="Aptos Narrow" w:cs="Times New Roman"/>
+                <w:color w:val="000000"/>
+                <w:kern w:val="0"/>
+                <w:lang w:eastAsia="en-IN" w:bidi="ta-IN"/>
+                <w14:ligatures w14:val="none"/>
+              </w:rPr>
+              <w:t xml:space="preserve"> AND PUBYEAR &lt; 2027 AND NOT ( TITLE-ABS-KEY ( human OR patient* OR medical OR medicine OR clinical OR MRI OR CT OR </w:t>
+            </w:r>
+            <w:proofErr w:type="spellStart"/>
+            <w:r>
+              <w:rPr>
+                <w:rFonts w:ascii="Aptos Narrow" w:eastAsia="Times New Roman" w:hAnsi="Aptos Narrow" w:cs="Times New Roman"/>
+                <w:color w:val="000000"/>
+                <w:kern w:val="0"/>
+                <w:lang w:eastAsia="en-IN" w:bidi="ta-IN"/>
+                <w14:ligatures w14:val="none"/>
+              </w:rPr>
+              <w:t>tumor</w:t>
+            </w:r>
+            <w:proofErr w:type="spellEnd"/>
+            <w:r>
+              <w:rPr>
+                <w:rFonts w:ascii="Aptos Narrow" w:eastAsia="Times New Roman" w:hAnsi="Aptos Narrow" w:cs="Times New Roman"/>
+                <w:color w:val="000000"/>
+                <w:kern w:val="0"/>
+                <w:lang w:eastAsia="en-IN" w:bidi="ta-IN"/>
+                <w14:ligatures w14:val="none"/>
+              </w:rPr>
+              <w:t xml:space="preserve">* OR cancer* OR </w:t>
+            </w:r>
+            <w:proofErr w:type="spellStart"/>
+            <w:r>
+              <w:rPr>
+                <w:rFonts w:ascii="Aptos Narrow" w:eastAsia="Times New Roman" w:hAnsi="Aptos Narrow" w:cs="Times New Roman"/>
+                <w:color w:val="000000"/>
+                <w:kern w:val="0"/>
+                <w:lang w:eastAsia="en-IN" w:bidi="ta-IN"/>
+                <w14:ligatures w14:val="none"/>
+              </w:rPr>
+              <w:t>alzheimer</w:t>
+            </w:r>
+            <w:proofErr w:type="spellEnd"/>
+            <w:r>
+              <w:rPr>
+                <w:rFonts w:ascii="Aptos Narrow" w:eastAsia="Times New Roman" w:hAnsi="Aptos Narrow" w:cs="Times New Roman"/>
+                <w:color w:val="000000"/>
+                <w:kern w:val="0"/>
+                <w:lang w:eastAsia="en-IN" w:bidi="ta-IN"/>
+                <w14:ligatures w14:val="none"/>
+              </w:rPr>
+              <w:t xml:space="preserve">* OR brain OR </w:t>
+            </w:r>
+            <w:proofErr w:type="spellStart"/>
+            <w:r>
+              <w:rPr>
+                <w:rFonts w:ascii="Aptos Narrow" w:eastAsia="Times New Roman" w:hAnsi="Aptos Narrow" w:cs="Times New Roman"/>
+                <w:color w:val="000000"/>
+                <w:kern w:val="0"/>
+                <w:lang w:eastAsia="en-IN" w:bidi="ta-IN"/>
+                <w14:ligatures w14:val="none"/>
+              </w:rPr>
+              <w:t>radiolog</w:t>
+            </w:r>
+            <w:proofErr w:type="spellEnd"/>
+            <w:r>
+              <w:rPr>
+                <w:rFonts w:ascii="Aptos Narrow" w:eastAsia="Times New Roman" w:hAnsi="Aptos Narrow" w:cs="Times New Roman"/>
+                <w:color w:val="000000"/>
+                <w:kern w:val="0"/>
+                <w:lang w:eastAsia="en-IN" w:bidi="ta-IN"/>
+                <w14:ligatures w14:val="none"/>
+              </w:rPr>
+              <w:t xml:space="preserve">* OR pathology ) ) AND ( LIMIT-TO ( SUBJAREA,"AGRI" ) OR LIMIT-TO ( SUBJAREA,"COMP" ) OR LIMIT-TO ( </w:t>
+            </w:r>
+            <w:r>
+              <w:rPr>
+                <w:rFonts w:ascii="Aptos Narrow" w:eastAsia="Times New Roman" w:hAnsi="Aptos Narrow" w:cs="Times New Roman"/>
+                <w:color w:val="000000"/>
+                <w:kern w:val="0"/>
+                <w:lang w:eastAsia="en-IN" w:bidi="ta-IN"/>
+                <w14:ligatures w14:val="none"/>
+              </w:rPr>
+              <w:lastRenderedPageBreak/>
+              <w:t>SUBJAREA,"ENVI" ) OR LIMIT-TO ( SUBJAREA,"ENGI" ) OR LIMIT-TO ( SUBJAREA,"EART" ) ) AND ( LIMIT-TO ( DOCTYPE,"</w:t>
+            </w:r>
+            <w:proofErr w:type="spellStart"/>
+            <w:r>
+              <w:rPr>
+                <w:rFonts w:ascii="Aptos Narrow" w:eastAsia="Times New Roman" w:hAnsi="Aptos Narrow" w:cs="Times New Roman"/>
+                <w:color w:val="000000"/>
+                <w:kern w:val="0"/>
+                <w:lang w:eastAsia="en-IN" w:bidi="ta-IN"/>
+                <w14:ligatures w14:val="none"/>
+              </w:rPr>
+              <w:t>ar</w:t>
+            </w:r>
+            <w:proofErr w:type="spellEnd"/>
+            <w:r>
+              <w:rPr>
+                <w:rFonts w:ascii="Aptos Narrow" w:eastAsia="Times New Roman" w:hAnsi="Aptos Narrow" w:cs="Times New Roman"/>
+                <w:color w:val="000000"/>
+                <w:kern w:val="0"/>
+                <w:lang w:eastAsia="en-IN" w:bidi="ta-IN"/>
+                <w14:ligatures w14:val="none"/>
+              </w:rPr>
+              <w:t>" ) )</w:t>
             </w:r>
           </w:p>
         </w:tc>

</xml_diff>

<commit_message>
final sankey diagram working with fully coloured
</commit_message>
<xml_diff>
--- a/Explainable AI in Computer Vision for Agricultural Disease and pest.docx
+++ b/Explainable AI in Computer Vision for Agricultural Disease and pest.docx
@@ -23,31 +23,7 @@
           <w:sz w:val="24"/>
           <w:szCs w:val="24"/>
         </w:rPr>
-        <w:t xml:space="preserve">Explainable AI in Computer Vision for Agricultural Disease and Pest Detection </w:t>
-      </w:r>
-      <w:proofErr w:type="gramStart"/>
-      <w:r>
-        <w:rPr>
-          <w:rFonts w:ascii="Times New Roman" w:hAnsi="Times New Roman" w:cs="Times New Roman"/>
-          <w:b/>
-          <w:bCs/>
-          <w:color w:val="0F9ED5" w:themeColor="accent4"/>
-          <w:sz w:val="24"/>
-          <w:szCs w:val="24"/>
-        </w:rPr>
-        <w:t>A</w:t>
-      </w:r>
-      <w:proofErr w:type="gramEnd"/>
-      <w:r>
-        <w:rPr>
-          <w:rFonts w:ascii="Times New Roman" w:hAnsi="Times New Roman" w:cs="Times New Roman"/>
-          <w:b/>
-          <w:bCs/>
-          <w:color w:val="0F9ED5" w:themeColor="accent4"/>
-          <w:sz w:val="24"/>
-          <w:szCs w:val="24"/>
-        </w:rPr>
-        <w:t xml:space="preserve"> Systematic Review of Methods, Trends, and Future Directions</w:t>
+        <w:t>Explainable AI in Computer Vision for Agricultural Disease and Pest Detection A Systematic Review of Methods, Trends, and Future Directions</w:t>
       </w:r>
     </w:p>
     <w:p>
@@ -911,27 +887,7 @@
           <w:sz w:val="24"/>
           <w:szCs w:val="24"/>
         </w:rPr>
-        <w:t xml:space="preserve"> there </w:t>
-      </w:r>
-      <w:proofErr w:type="gramStart"/>
-      <w:r>
-        <w:rPr>
-          <w:rFonts w:ascii="Times New Roman" w:hAnsi="Times New Roman" w:cs="Times New Roman"/>
-          <w:color w:val="0F9ED5" w:themeColor="accent4"/>
-          <w:sz w:val="24"/>
-          <w:szCs w:val="24"/>
-        </w:rPr>
-        <w:t>is</w:t>
-      </w:r>
-      <w:proofErr w:type="gramEnd"/>
-      <w:r>
-        <w:rPr>
-          <w:rFonts w:ascii="Times New Roman" w:hAnsi="Times New Roman" w:cs="Times New Roman"/>
-          <w:color w:val="0F9ED5" w:themeColor="accent4"/>
-          <w:sz w:val="24"/>
-          <w:szCs w:val="24"/>
-        </w:rPr>
-        <w:t xml:space="preserve"> remarkable achievements in technologies, still there is lack of </w:t>
+        <w:t xml:space="preserve"> there is remarkable achievements in technologies, still there is lack of </w:t>
       </w:r>
       <w:r>
         <w:rPr>
@@ -1964,27 +1920,7 @@
           <w:sz w:val="24"/>
           <w:szCs w:val="24"/>
         </w:rPr>
-        <w:t xml:space="preserve"> model introduced by scott </w:t>
-      </w:r>
-      <w:proofErr w:type="gramStart"/>
-      <w:r>
-        <w:rPr>
-          <w:rFonts w:ascii="Times New Roman" w:hAnsi="Times New Roman" w:cs="Times New Roman"/>
-          <w:color w:val="0F9ED5" w:themeColor="accent4"/>
-          <w:sz w:val="24"/>
-          <w:szCs w:val="24"/>
-        </w:rPr>
-        <w:t>2017  can</w:t>
-      </w:r>
-      <w:proofErr w:type="gramEnd"/>
-      <w:r>
-        <w:rPr>
-          <w:rFonts w:ascii="Times New Roman" w:hAnsi="Times New Roman" w:cs="Times New Roman"/>
-          <w:color w:val="0F9ED5" w:themeColor="accent4"/>
-          <w:sz w:val="24"/>
-          <w:szCs w:val="24"/>
-        </w:rPr>
-        <w:t xml:space="preserve"> adapt to traditional ML models, complex DL architectures and even large language Models (LLMs)</w:t>
+        <w:t xml:space="preserve"> model introduced by scott 2017  can adapt to traditional ML models, complex DL architectures and even large language Models (LLMs)</w:t>
       </w:r>
       <w:r>
         <w:rPr>
@@ -2148,27 +2084,7 @@
           <w:sz w:val="24"/>
           <w:szCs w:val="24"/>
         </w:rPr>
-        <w:t xml:space="preserve"> multiple studies utilizing XAI in agricultural CV systems, there is </w:t>
-      </w:r>
-      <w:proofErr w:type="gramStart"/>
-      <w:r>
-        <w:rPr>
-          <w:rFonts w:ascii="Times New Roman" w:hAnsi="Times New Roman" w:cs="Times New Roman"/>
-          <w:color w:val="0F9ED5" w:themeColor="accent4"/>
-          <w:sz w:val="24"/>
-          <w:szCs w:val="24"/>
-        </w:rPr>
-        <w:t>a</w:t>
-      </w:r>
-      <w:proofErr w:type="gramEnd"/>
-      <w:r>
-        <w:rPr>
-          <w:rFonts w:ascii="Times New Roman" w:hAnsi="Times New Roman" w:cs="Times New Roman"/>
-          <w:color w:val="0F9ED5" w:themeColor="accent4"/>
-          <w:sz w:val="24"/>
-          <w:szCs w:val="24"/>
-        </w:rPr>
-        <w:t xml:space="preserve"> absence of critical </w:t>
+        <w:t xml:space="preserve"> multiple studies utilizing XAI in agricultural CV systems, there is a absence of critical </w:t>
       </w:r>
       <w:r>
         <w:rPr>
@@ -2859,6 +2775,7 @@
       <w:r>
         <w:rPr>
           <w:rFonts w:ascii="Times New Roman" w:hAnsi="Times New Roman" w:cs="Times New Roman"/>
+          <w:noProof/>
           <w:color w:val="0F9ED5" w:themeColor="accent4"/>
           <w:sz w:val="24"/>
           <w:szCs w:val="24"/>
@@ -4351,6 +4268,95 @@
       </w:pPr>
       <w:r>
         <w:rPr>
+          <w:noProof/>
+        </w:rPr>
+        <w:lastRenderedPageBreak/>
+        <w:drawing>
+          <wp:inline distT="0" distB="0" distL="0" distR="0" wp14:anchorId="72EEE7CF" wp14:editId="71E76F57">
+            <wp:extent cx="5731510" cy="4585970"/>
+            <wp:effectExtent l="0" t="0" r="2540" b="5080"/>
+            <wp:docPr id="1888031434" name="Picture 4"/>
+            <wp:cNvGraphicFramePr>
+              <a:graphicFrameLocks xmlns:a="http://schemas.openxmlformats.org/drawingml/2006/main" noChangeAspect="1"/>
+            </wp:cNvGraphicFramePr>
+            <a:graphic xmlns:a="http://schemas.openxmlformats.org/drawingml/2006/main">
+              <a:graphicData uri="http://schemas.openxmlformats.org/drawingml/2006/picture">
+                <pic:pic xmlns:pic="http://schemas.openxmlformats.org/drawingml/2006/picture">
+                  <pic:nvPicPr>
+                    <pic:cNvPr id="0" name="Picture 10"/>
+                    <pic:cNvPicPr>
+                      <a:picLocks noChangeAspect="1" noChangeArrowheads="1"/>
+                    </pic:cNvPicPr>
+                  </pic:nvPicPr>
+                  <pic:blipFill>
+                    <a:blip r:embed="rId6">
+                      <a:extLst>
+                        <a:ext uri="{28A0092B-C50C-407E-A947-70E740481C1C}">
+                          <a14:useLocalDpi xmlns:a14="http://schemas.microsoft.com/office/drawing/2010/main" val="0"/>
+                        </a:ext>
+                      </a:extLst>
+                    </a:blip>
+                    <a:srcRect/>
+                    <a:stretch>
+                      <a:fillRect/>
+                    </a:stretch>
+                  </pic:blipFill>
+                  <pic:spPr bwMode="auto">
+                    <a:xfrm>
+                      <a:off x="0" y="0"/>
+                      <a:ext cx="5731510" cy="4585970"/>
+                    </a:xfrm>
+                    <a:prstGeom prst="rect">
+                      <a:avLst/>
+                    </a:prstGeom>
+                    <a:noFill/>
+                    <a:ln>
+                      <a:noFill/>
+                    </a:ln>
+                  </pic:spPr>
+                </pic:pic>
+              </a:graphicData>
+            </a:graphic>
+          </wp:inline>
+        </w:drawing>
+      </w:r>
+    </w:p>
+    <w:p>
+      <w:pPr>
+        <w:rPr>
+          <w:rFonts w:ascii="Times New Roman" w:hAnsi="Times New Roman" w:cs="Times New Roman"/>
+          <w:b/>
+          <w:bCs/>
+          <w:color w:val="EE0000"/>
+          <w:sz w:val="24"/>
+          <w:szCs w:val="24"/>
+        </w:rPr>
+      </w:pPr>
+      <w:r>
+        <w:rPr>
+          <w:rFonts w:ascii="Times New Roman" w:hAnsi="Times New Roman" w:cs="Times New Roman"/>
+          <w:b/>
+          <w:bCs/>
+          <w:color w:val="EE0000"/>
+          <w:sz w:val="24"/>
+          <w:szCs w:val="24"/>
+        </w:rPr>
+        <w:br w:type="page"/>
+      </w:r>
+    </w:p>
+    <w:p>
+      <w:pPr>
+        <w:rPr>
+          <w:rFonts w:ascii="Times New Roman" w:hAnsi="Times New Roman" w:cs="Times New Roman"/>
+          <w:b/>
+          <w:bCs/>
+          <w:color w:val="EE0000"/>
+          <w:sz w:val="24"/>
+          <w:szCs w:val="24"/>
+        </w:rPr>
+      </w:pPr>
+      <w:r>
+        <w:rPr>
           <w:rFonts w:ascii="Times New Roman" w:hAnsi="Times New Roman" w:cs="Times New Roman"/>
           <w:b/>
           <w:bCs/>
@@ -5595,7 +5601,7 @@
                     <pic:cNvPicPr/>
                   </pic:nvPicPr>
                   <pic:blipFill>
-                    <a:blip r:embed="rId6"/>
+                    <a:blip r:embed="rId7"/>
                     <a:stretch>
                       <a:fillRect/>
                     </a:stretch>
@@ -5925,19 +5931,8 @@
           <w:sz w:val="24"/>
           <w:szCs w:val="24"/>
         </w:rPr>
-        <w:t xml:space="preserve">” </w:t>
-      </w:r>
-      <w:proofErr w:type="gramStart"/>
-      <w:r>
-        <w:rPr>
-          <w:rFonts w:ascii="Times New Roman" w:hAnsi="Times New Roman" w:cs="Times New Roman"/>
-          <w:color w:val="EE0000"/>
-          <w:sz w:val="24"/>
-          <w:szCs w:val="24"/>
-        </w:rPr>
-        <w:t>models</w:t>
-      </w:r>
-      <w:proofErr w:type="gramEnd"/>
+        <w:t>” models</w:t>
+      </w:r>
       <w:r>
         <w:rPr>
           <w:rFonts w:ascii="Times New Roman" w:hAnsi="Times New Roman" w:cs="Times New Roman"/>
@@ -6199,27 +6194,7 @@
           <w:sz w:val="24"/>
           <w:szCs w:val="24"/>
         </w:rPr>
-        <w:t xml:space="preserve">, it is </w:t>
-      </w:r>
-      <w:proofErr w:type="gramStart"/>
-      <w:r>
-        <w:rPr>
-          <w:rFonts w:ascii="Times New Roman" w:hAnsi="Times New Roman" w:cs="Times New Roman"/>
-          <w:color w:val="EE0000"/>
-          <w:sz w:val="24"/>
-          <w:szCs w:val="24"/>
-        </w:rPr>
-        <w:t>clearly evident</w:t>
-      </w:r>
-      <w:proofErr w:type="gramEnd"/>
-      <w:r>
-        <w:rPr>
-          <w:rFonts w:ascii="Times New Roman" w:hAnsi="Times New Roman" w:cs="Times New Roman"/>
-          <w:color w:val="EE0000"/>
-          <w:sz w:val="24"/>
-          <w:szCs w:val="24"/>
-        </w:rPr>
-        <w:t xml:space="preserve"> that there is clear upward </w:t>
+        <w:t xml:space="preserve">, it is clearly evident that there is clear upward </w:t>
       </w:r>
       <w:r>
         <w:rPr>
@@ -6409,7 +6384,7 @@
                     <pic:cNvPicPr/>
                   </pic:nvPicPr>
                   <pic:blipFill>
-                    <a:blip r:embed="rId7"/>
+                    <a:blip r:embed="rId8"/>
                     <a:stretch>
                       <a:fillRect/>
                     </a:stretch>
@@ -10168,33 +10143,7 @@
                 <w:lang w:eastAsia="en-IN" w:bidi="ta-IN"/>
                 <w14:ligatures w14:val="none"/>
               </w:rPr>
-              <w:t xml:space="preserve">Early conceptualization of computer vision within the broader structural framework of the </w:t>
-            </w:r>
-            <w:proofErr w:type="gramStart"/>
-            <w:r>
-              <w:rPr>
-                <w:rFonts w:ascii="Times New Roman" w:eastAsia="Times New Roman" w:hAnsi="Times New Roman" w:cs="Times New Roman"/>
-                <w:color w:val="EE0000"/>
-                <w:kern w:val="0"/>
-                <w:sz w:val="20"/>
-                <w:szCs w:val="20"/>
-                <w:lang w:eastAsia="en-IN" w:bidi="ta-IN"/>
-                <w14:ligatures w14:val="none"/>
-              </w:rPr>
-              <w:t>Agriculture</w:t>
-            </w:r>
-            <w:proofErr w:type="gramEnd"/>
-            <w:r>
-              <w:rPr>
-                <w:rFonts w:ascii="Times New Roman" w:eastAsia="Times New Roman" w:hAnsi="Times New Roman" w:cs="Times New Roman"/>
-                <w:color w:val="EE0000"/>
-                <w:kern w:val="0"/>
-                <w:sz w:val="20"/>
-                <w:szCs w:val="20"/>
-                <w:lang w:eastAsia="en-IN" w:bidi="ta-IN"/>
-                <w14:ligatures w14:val="none"/>
-              </w:rPr>
-              <w:t xml:space="preserve"> 4.0 revolution.</w:t>
+              <w:t>Early conceptualization of computer vision within the broader structural framework of the Agriculture 4.0 revolution.</w:t>
             </w:r>
           </w:p>
         </w:tc>
@@ -18132,7 +18081,6 @@
   <w:style w:type="character" w:default="1" w:styleId="DefaultParagraphFont">
     <w:name w:val="Default Paragraph Font"/>
     <w:uiPriority w:val="1"/>
-    <w:semiHidden/>
     <w:unhideWhenUsed/>
   </w:style>
   <w:style w:type="table" w:default="1" w:styleId="TableNormal">

</xml_diff>